<commit_message>
feat: add Hebrew sections 14A/14B (intermediate solution + tactical employment)
Co-authored-by: Cursor <cursoragent@cursor.com>
</commit_message>
<xml_diff>
--- a/exports/research-he.docx
+++ b/exports/research-he.docx
@@ -14725,6 +14725,2202 @@
       </w:tr>
     </w:tbl>
     <w:p/>
+    <w:p>
+      <w:r>
+        <w:br w:type="page"/>
+      </w:r>
+    </w:p>
+    <w:p>
+      <w:pPr>
+        <w:pStyle w:val="Heading1"/>
+      </w:pPr>
+      <w:r>
+        <w:t>14א. פתרון ביניים: יכולת מבצעית תוך 6 חודשים</w:t>
+      </w:r>
+    </w:p>
+    <w:p>
+      <w:r>
+        <w:t>סעיף זה מציג פתרון ביניים הניתן לפריסה תוך 6 חודשים תוך שימוש ברכיבים מסחריים בלבד, ללא המתנה לפיתוח מלא של Airlander 10.</w:t>
+      </w:r>
+    </w:p>
+    <w:p>
+      <w:pPr>
+        <w:pStyle w:val="Heading2"/>
+      </w:pPr>
+      <w:r>
+        <w:t>קונספט: אווירוסטט טקטי + תליוני כבל CF</w:t>
+      </w:r>
+    </w:p>
+    <w:p>
+      <w:r>
+        <w:t>באמצעות אווירוסטטים טקטיים קיימים (TCOM 12M/22M, Skystar 180, Silicis DURUS, או Aerobavovna AB12TC) בשילוב תליוני כבל סיבי פחמן, ניתן לפרוס מחסום פעיל תוך 6 חודשים בהשקעה של $3–10M למגזר גבול.</w:t>
+      </w:r>
+    </w:p>
+    <w:p>
+      <w:pPr>
+        <w:pStyle w:val="Heading2"/>
+      </w:pPr>
+      <w:r>
+        <w:t>פלטפורמות זמינות (מבצעיות היום)</w:t>
+      </w:r>
+    </w:p>
+    <w:tbl>
+      <w:tblPr>
+        <w:tblStyle w:val="TableGrid"/>
+        <w:tblW w:type="auto" w:w="0"/>
+        <w:jc w:val="center"/>
+        <w:tblLook w:firstColumn="1" w:firstRow="1" w:lastColumn="0" w:lastRow="0" w:noHBand="0" w:noVBand="1" w:val="04A0"/>
+      </w:tblPr>
+      <w:tblGrid>
+        <w:gridCol w:w="1337"/>
+        <w:gridCol w:w="1337"/>
+        <w:gridCol w:w="1337"/>
+        <w:gridCol w:w="1337"/>
+        <w:gridCol w:w="1337"/>
+        <w:gridCol w:w="1337"/>
+        <w:gridCol w:w="1337"/>
+      </w:tblGrid>
+      <w:tr>
+        <w:tc>
+          <w:tcPr>
+            <w:tcW w:type="dxa" w:w="1337"/>
+          </w:tcPr>
+          <w:p>
+            <w:r>
+              <w:rPr>
+                <w:b/>
+                <w:sz w:val="18"/>
+              </w:rPr>
+              <w:t>פלטפורמה</w:t>
+            </w:r>
+          </w:p>
+        </w:tc>
+        <w:tc>
+          <w:tcPr>
+            <w:tcW w:type="dxa" w:w="1337"/>
+          </w:tcPr>
+          <w:p>
+            <w:r>
+              <w:rPr>
+                <w:b/>
+                <w:sz w:val="18"/>
+              </w:rPr>
+              <w:t>מטען</w:t>
+            </w:r>
+          </w:p>
+        </w:tc>
+        <w:tc>
+          <w:tcPr>
+            <w:tcW w:type="dxa" w:w="1337"/>
+          </w:tcPr>
+          <w:p>
+            <w:r>
+              <w:rPr>
+                <w:b/>
+                <w:sz w:val="18"/>
+              </w:rPr>
+              <w:t>גובה</w:t>
+            </w:r>
+          </w:p>
+        </w:tc>
+        <w:tc>
+          <w:tcPr>
+            <w:tcW w:type="dxa" w:w="1337"/>
+          </w:tcPr>
+          <w:p>
+            <w:r>
+              <w:rPr>
+                <w:b/>
+                <w:sz w:val="18"/>
+              </w:rPr>
+              <w:t>סיבולת</w:t>
+            </w:r>
+          </w:p>
+        </w:tc>
+        <w:tc>
+          <w:tcPr>
+            <w:tcW w:type="dxa" w:w="1337"/>
+          </w:tcPr>
+          <w:p>
+            <w:r>
+              <w:rPr>
+                <w:b/>
+                <w:sz w:val="18"/>
+              </w:rPr>
+              <w:t>זמן פריסה</w:t>
+            </w:r>
+          </w:p>
+        </w:tc>
+        <w:tc>
+          <w:tcPr>
+            <w:tcW w:type="dxa" w:w="1337"/>
+          </w:tcPr>
+          <w:p>
+            <w:r>
+              <w:rPr>
+                <w:b/>
+                <w:sz w:val="18"/>
+              </w:rPr>
+              <w:t>עלות</w:t>
+            </w:r>
+          </w:p>
+        </w:tc>
+        <w:tc>
+          <w:tcPr>
+            <w:tcW w:type="dxa" w:w="1337"/>
+          </w:tcPr>
+          <w:p>
+            <w:r>
+              <w:rPr>
+                <w:b/>
+                <w:sz w:val="18"/>
+              </w:rPr>
+              <w:t>מקור</w:t>
+            </w:r>
+          </w:p>
+        </w:tc>
+      </w:tr>
+      <w:tr>
+        <w:tc>
+          <w:tcPr>
+            <w:tcW w:type="dxa" w:w="1337"/>
+          </w:tcPr>
+          <w:p>
+            <w:r>
+              <w:rPr>
+                <w:sz w:val="18"/>
+              </w:rPr>
+              <w:t>TCOM 12M</w:t>
+            </w:r>
+          </w:p>
+        </w:tc>
+        <w:tc>
+          <w:tcPr>
+            <w:tcW w:type="dxa" w:w="1337"/>
+          </w:tcPr>
+          <w:p>
+            <w:r>
+              <w:rPr>
+                <w:sz w:val="18"/>
+              </w:rPr>
+              <w:t>~15 ק"ג</w:t>
+            </w:r>
+          </w:p>
+        </w:tc>
+        <w:tc>
+          <w:tcPr>
+            <w:tcW w:type="dxa" w:w="1337"/>
+          </w:tcPr>
+          <w:p>
+            <w:r>
+              <w:rPr>
+                <w:sz w:val="18"/>
+              </w:rPr>
+              <w:t>300 מ'</w:t>
+            </w:r>
+          </w:p>
+        </w:tc>
+        <w:tc>
+          <w:tcPr>
+            <w:tcW w:type="dxa" w:w="1337"/>
+          </w:tcPr>
+          <w:p>
+            <w:r>
+              <w:rPr>
+                <w:sz w:val="18"/>
+              </w:rPr>
+              <w:t>ימים</w:t>
+            </w:r>
+          </w:p>
+        </w:tc>
+        <w:tc>
+          <w:tcPr>
+            <w:tcW w:type="dxa" w:w="1337"/>
+          </w:tcPr>
+          <w:p>
+            <w:r>
+              <w:rPr>
+                <w:sz w:val="18"/>
+              </w:rPr>
+              <w:t>שעות</w:t>
+            </w:r>
+          </w:p>
+        </w:tc>
+        <w:tc>
+          <w:tcPr>
+            <w:tcW w:type="dxa" w:w="1337"/>
+          </w:tcPr>
+          <w:p>
+            <w:r>
+              <w:rPr>
+                <w:sz w:val="18"/>
+              </w:rPr>
+              <w:t>~$200K</w:t>
+            </w:r>
+          </w:p>
+        </w:tc>
+        <w:tc>
+          <w:tcPr>
+            <w:tcW w:type="dxa" w:w="1337"/>
+          </w:tcPr>
+          <w:p>
+            <w:r>
+              <w:rPr>
+                <w:sz w:val="18"/>
+              </w:rPr>
+              <w:t>[T16]</w:t>
+            </w:r>
+          </w:p>
+        </w:tc>
+      </w:tr>
+      <w:tr>
+        <w:tc>
+          <w:tcPr>
+            <w:tcW w:type="dxa" w:w="1337"/>
+          </w:tcPr>
+          <w:p>
+            <w:r>
+              <w:rPr>
+                <w:sz w:val="18"/>
+              </w:rPr>
+              <w:t>TCOM 22M</w:t>
+            </w:r>
+          </w:p>
+        </w:tc>
+        <w:tc>
+          <w:tcPr>
+            <w:tcW w:type="dxa" w:w="1337"/>
+          </w:tcPr>
+          <w:p>
+            <w:r>
+              <w:rPr>
+                <w:sz w:val="18"/>
+              </w:rPr>
+              <w:t>~50 ק"ג</w:t>
+            </w:r>
+          </w:p>
+        </w:tc>
+        <w:tc>
+          <w:tcPr>
+            <w:tcW w:type="dxa" w:w="1337"/>
+          </w:tcPr>
+          <w:p>
+            <w:r>
+              <w:rPr>
+                <w:sz w:val="18"/>
+              </w:rPr>
+              <w:t>500 מ'</w:t>
+            </w:r>
+          </w:p>
+        </w:tc>
+        <w:tc>
+          <w:tcPr>
+            <w:tcW w:type="dxa" w:w="1337"/>
+          </w:tcPr>
+          <w:p>
+            <w:r>
+              <w:rPr>
+                <w:sz w:val="18"/>
+              </w:rPr>
+              <w:t>ימים–שבועות</w:t>
+            </w:r>
+          </w:p>
+        </w:tc>
+        <w:tc>
+          <w:tcPr>
+            <w:tcW w:type="dxa" w:w="1337"/>
+          </w:tcPr>
+          <w:p>
+            <w:r>
+              <w:rPr>
+                <w:sz w:val="18"/>
+              </w:rPr>
+              <w:t>שעות</w:t>
+            </w:r>
+          </w:p>
+        </w:tc>
+        <w:tc>
+          <w:tcPr>
+            <w:tcW w:type="dxa" w:w="1337"/>
+          </w:tcPr>
+          <w:p>
+            <w:r>
+              <w:rPr>
+                <w:sz w:val="18"/>
+              </w:rPr>
+              <w:t>~$500K</w:t>
+            </w:r>
+          </w:p>
+        </w:tc>
+        <w:tc>
+          <w:tcPr>
+            <w:tcW w:type="dxa" w:w="1337"/>
+          </w:tcPr>
+          <w:p>
+            <w:r>
+              <w:rPr>
+                <w:sz w:val="18"/>
+              </w:rPr>
+              <w:t>[T16]</w:t>
+            </w:r>
+          </w:p>
+        </w:tc>
+      </w:tr>
+      <w:tr>
+        <w:tc>
+          <w:tcPr>
+            <w:tcW w:type="dxa" w:w="1337"/>
+          </w:tcPr>
+          <w:p>
+            <w:r>
+              <w:rPr>
+                <w:sz w:val="18"/>
+              </w:rPr>
+              <w:t>Skystar 180 (RT LTA)</w:t>
+            </w:r>
+          </w:p>
+        </w:tc>
+        <w:tc>
+          <w:tcPr>
+            <w:tcW w:type="dxa" w:w="1337"/>
+          </w:tcPr>
+          <w:p>
+            <w:r>
+              <w:rPr>
+                <w:sz w:val="18"/>
+              </w:rPr>
+              <w:t>18 ק"ג</w:t>
+            </w:r>
+          </w:p>
+        </w:tc>
+        <w:tc>
+          <w:tcPr>
+            <w:tcW w:type="dxa" w:w="1337"/>
+          </w:tcPr>
+          <w:p>
+            <w:r>
+              <w:rPr>
+                <w:sz w:val="18"/>
+              </w:rPr>
+              <w:t>300 מ'</w:t>
+            </w:r>
+          </w:p>
+        </w:tc>
+        <w:tc>
+          <w:tcPr>
+            <w:tcW w:type="dxa" w:w="1337"/>
+          </w:tcPr>
+          <w:p>
+            <w:r>
+              <w:rPr>
+                <w:sz w:val="18"/>
+              </w:rPr>
+              <w:t>72 שעות רצופות</w:t>
+            </w:r>
+          </w:p>
+        </w:tc>
+        <w:tc>
+          <w:tcPr>
+            <w:tcW w:type="dxa" w:w="1337"/>
+          </w:tcPr>
+          <w:p>
+            <w:r>
+              <w:rPr>
+                <w:sz w:val="18"/>
+              </w:rPr>
+              <w:t>20 דקות</w:t>
+            </w:r>
+          </w:p>
+        </w:tc>
+        <w:tc>
+          <w:tcPr>
+            <w:tcW w:type="dxa" w:w="1337"/>
+          </w:tcPr>
+          <w:p>
+            <w:r>
+              <w:rPr>
+                <w:sz w:val="18"/>
+              </w:rPr>
+              <w:t>~$300K</w:t>
+            </w:r>
+          </w:p>
+        </w:tc>
+        <w:tc>
+          <w:tcPr>
+            <w:tcW w:type="dxa" w:w="1337"/>
+          </w:tcPr>
+          <w:p>
+            <w:r>
+              <w:rPr>
+                <w:sz w:val="18"/>
+              </w:rPr>
+              <w:t>[T13]</w:t>
+            </w:r>
+          </w:p>
+        </w:tc>
+      </w:tr>
+      <w:tr>
+        <w:tc>
+          <w:tcPr>
+            <w:tcW w:type="dxa" w:w="1337"/>
+          </w:tcPr>
+          <w:p>
+            <w:r>
+              <w:rPr>
+                <w:sz w:val="18"/>
+              </w:rPr>
+              <w:t>Silicis DURUS</w:t>
+            </w:r>
+          </w:p>
+        </w:tc>
+        <w:tc>
+          <w:tcPr>
+            <w:tcW w:type="dxa" w:w="1337"/>
+          </w:tcPr>
+          <w:p>
+            <w:r>
+              <w:rPr>
+                <w:sz w:val="18"/>
+              </w:rPr>
+              <w:t>30+ ק"ג</w:t>
+            </w:r>
+          </w:p>
+        </w:tc>
+        <w:tc>
+          <w:tcPr>
+            <w:tcW w:type="dxa" w:w="1337"/>
+          </w:tcPr>
+          <w:p>
+            <w:r>
+              <w:rPr>
+                <w:sz w:val="18"/>
+              </w:rPr>
+              <w:t>500 מ'</w:t>
+            </w:r>
+          </w:p>
+        </w:tc>
+        <w:tc>
+          <w:tcPr>
+            <w:tcW w:type="dxa" w:w="1337"/>
+          </w:tcPr>
+          <w:p>
+            <w:r>
+              <w:rPr>
+                <w:sz w:val="18"/>
+              </w:rPr>
+              <w:t>ימים–שבועות</w:t>
+            </w:r>
+          </w:p>
+        </w:tc>
+        <w:tc>
+          <w:tcPr>
+            <w:tcW w:type="dxa" w:w="1337"/>
+          </w:tcPr>
+          <w:p>
+            <w:r>
+              <w:rPr>
+                <w:sz w:val="18"/>
+              </w:rPr>
+              <w:t>דקות</w:t>
+            </w:r>
+          </w:p>
+        </w:tc>
+        <w:tc>
+          <w:tcPr>
+            <w:tcW w:type="dxa" w:w="1337"/>
+          </w:tcPr>
+          <w:p>
+            <w:r>
+              <w:rPr>
+                <w:sz w:val="18"/>
+              </w:rPr>
+              <w:t>~$500K</w:t>
+            </w:r>
+          </w:p>
+        </w:tc>
+        <w:tc>
+          <w:tcPr>
+            <w:tcW w:type="dxa" w:w="1337"/>
+          </w:tcPr>
+          <w:p>
+            <w:r>
+              <w:rPr>
+                <w:sz w:val="18"/>
+              </w:rPr>
+              <w:t>[T14]</w:t>
+            </w:r>
+          </w:p>
+        </w:tc>
+      </w:tr>
+      <w:tr>
+        <w:tc>
+          <w:tcPr>
+            <w:tcW w:type="dxa" w:w="1337"/>
+          </w:tcPr>
+          <w:p>
+            <w:r>
+              <w:rPr>
+                <w:sz w:val="18"/>
+              </w:rPr>
+              <w:t>Aerobavovna AB12TC</w:t>
+            </w:r>
+          </w:p>
+        </w:tc>
+        <w:tc>
+          <w:tcPr>
+            <w:tcW w:type="dxa" w:w="1337"/>
+          </w:tcPr>
+          <w:p>
+            <w:r>
+              <w:rPr>
+                <w:sz w:val="18"/>
+              </w:rPr>
+              <w:t>5.66 ק"ג (דגמי 10/25 ק"ג בהכנה)</w:t>
+            </w:r>
+          </w:p>
+        </w:tc>
+        <w:tc>
+          <w:tcPr>
+            <w:tcW w:type="dxa" w:w="1337"/>
+          </w:tcPr>
+          <w:p>
+            <w:r>
+              <w:rPr>
+                <w:sz w:val="18"/>
+              </w:rPr>
+              <w:t>100–700 מ'</w:t>
+            </w:r>
+          </w:p>
+        </w:tc>
+        <w:tc>
+          <w:tcPr>
+            <w:tcW w:type="dxa" w:w="1337"/>
+          </w:tcPr>
+          <w:p>
+            <w:r>
+              <w:rPr>
+                <w:sz w:val="18"/>
+              </w:rPr>
+              <w:t>72 שעות</w:t>
+            </w:r>
+          </w:p>
+        </w:tc>
+        <w:tc>
+          <w:tcPr>
+            <w:tcW w:type="dxa" w:w="1337"/>
+          </w:tcPr>
+          <w:p>
+            <w:r>
+              <w:rPr>
+                <w:sz w:val="18"/>
+              </w:rPr>
+              <w:t>7 דקות</w:t>
+            </w:r>
+          </w:p>
+        </w:tc>
+        <w:tc>
+          <w:tcPr>
+            <w:tcW w:type="dxa" w:w="1337"/>
+          </w:tcPr>
+          <w:p>
+            <w:r>
+              <w:rPr>
+                <w:sz w:val="18"/>
+              </w:rPr>
+              <w:t>~$40K</w:t>
+            </w:r>
+          </w:p>
+        </w:tc>
+        <w:tc>
+          <w:tcPr>
+            <w:tcW w:type="dxa" w:w="1337"/>
+          </w:tcPr>
+          <w:p>
+            <w:r>
+              <w:rPr>
+                <w:sz w:val="18"/>
+              </w:rPr>
+              <w:t>[T15]</w:t>
+            </w:r>
+          </w:p>
+        </w:tc>
+      </w:tr>
+    </w:tbl>
+    <w:p/>
+    <w:p>
+      <w:pPr>
+        <w:pStyle w:val="Heading2"/>
+      </w:pPr>
+      <w:r>
+        <w:t>תוכנית פריסה ל-6 חודשים</w:t>
+      </w:r>
+    </w:p>
+    <w:p>
+      <w:r>
+        <w:t>חודשים 1–2: רכש ובדיקות</w:t>
+      </w:r>
+    </w:p>
+    <w:p>
+      <w:pPr>
+        <w:pStyle w:val="ListBullet"/>
+      </w:pPr>
+      <w:r>
+        <w:t>רכש 10–20 אווירוסטטים טקטיים (Skystar 180 או DURUS)</w:t>
+      </w:r>
+    </w:p>
+    <w:p>
+      <w:pPr>
+        <w:pStyle w:val="ListBullet"/>
+      </w:pPr>
+      <w:r>
+        <w:t>הזמנת חומר כבל CF: כבלי CF בקוטר 1 מ"מ, 100,000 מ' ב-~$1/מ' = $100K</w:t>
+      </w:r>
+    </w:p>
+    <w:p>
+      <w:pPr>
+        <w:pStyle w:val="ListBullet"/>
+      </w:pPr>
+      <w:r>
+        <w:t>תחילת בדיקות שילוב תליוני כבל (כבלי CF תלויים מכבל העגינה)</w:t>
+      </w:r>
+    </w:p>
+    <w:p>
+      <w:r>
+        <w:t>חודשים 3–4: שילוב וניסויי שדה</w:t>
+      </w:r>
+    </w:p>
+    <w:p>
+      <w:pPr>
+        <w:pStyle w:val="ListBullet"/>
+      </w:pPr>
+      <w:r>
+        <w:t>שילוב תליוני כבל CF עם מערכות כבל העגינה של האווירוסטט</w:t>
+      </w:r>
+    </w:p>
+    <w:p>
+      <w:pPr>
+        <w:pStyle w:val="ListBullet"/>
+      </w:pPr>
+      <w:r>
+        <w:t>כל אווירוסטט פורש 50–100 תליונים אנכיים (מרווח 2 מ', אורך 100–300 מ')</w:t>
+      </w:r>
+    </w:p>
+    <w:p>
+      <w:pPr>
+        <w:pStyle w:val="ListBullet"/>
+      </w:pPr>
+      <w:r>
+        <w:t>בדיקות מול רחפני מטרה במגרש ניסויים צבאי</w:t>
+      </w:r>
+    </w:p>
+    <w:p>
+      <w:pPr>
+        <w:pStyle w:val="ListBullet"/>
+      </w:pPr>
+      <w:r>
+        <w:t>שילוב עם מכ"ם C-UAS קיים לתיאום איומים</w:t>
+      </w:r>
+    </w:p>
+    <w:p>
+      <w:r>
+        <w:t>חודשים 5–6: יכולת מבצעית ראשונית (IOC)</w:t>
+      </w:r>
+    </w:p>
+    <w:p>
+      <w:pPr>
+        <w:pStyle w:val="ListBullet"/>
+      </w:pPr>
+      <w:r>
+        <w:t>פריסת סוללה ראשונה של 10 אווירוסטטים לאורך גבול ישראל-לבנון בנקודות חנק קריטיות</w:t>
+      </w:r>
+    </w:p>
+    <w:p>
+      <w:pPr>
+        <w:pStyle w:val="ListBullet"/>
+      </w:pPr>
+      <w:r>
+        <w:t>תצורה: אווירוסטטים ב-300–500 מ', תליוני CF יורדים כמעט עד לקרקע</w:t>
+      </w:r>
+    </w:p>
+    <w:p>
+      <w:pPr>
+        <w:pStyle w:val="ListBullet"/>
+      </w:pPr>
+      <w:r>
+        <w:t>כיסוי: 10 אווירוסטטים × מרווח 250 מ' = 2.5 ק"מ מחסום רציף לסוללה</w:t>
+      </w:r>
+    </w:p>
+    <w:p>
+      <w:pPr>
+        <w:pStyle w:val="ListBullet"/>
+      </w:pPr>
+      <w:r>
+        <w:t>4 סוללות = 10 ק"מ כיסוי במגזרים בעדיפות עליונה</w:t>
+      </w:r>
+    </w:p>
+    <w:p>
+      <w:pPr>
+        <w:pStyle w:val="Heading2"/>
+      </w:pPr>
+      <w:r>
+        <w:t>מפרטי פתרון הביניים</w:t>
+      </w:r>
+    </w:p>
+    <w:tbl>
+      <w:tblPr>
+        <w:tblStyle w:val="TableGrid"/>
+        <w:tblW w:type="auto" w:w="0"/>
+        <w:jc w:val="center"/>
+        <w:tblLook w:firstColumn="1" w:firstRow="1" w:lastColumn="0" w:lastRow="0" w:noHBand="0" w:noVBand="1" w:val="04A0"/>
+      </w:tblPr>
+      <w:tblGrid>
+        <w:gridCol w:w="4680"/>
+        <w:gridCol w:w="4680"/>
+      </w:tblGrid>
+      <w:tr>
+        <w:tc>
+          <w:tcPr>
+            <w:tcW w:type="dxa" w:w="4680"/>
+          </w:tcPr>
+          <w:p>
+            <w:r>
+              <w:rPr>
+                <w:b/>
+                <w:sz w:val="18"/>
+              </w:rPr>
+              <w:t>פרמטר</w:t>
+            </w:r>
+          </w:p>
+        </w:tc>
+        <w:tc>
+          <w:tcPr>
+            <w:tcW w:type="dxa" w:w="4680"/>
+          </w:tcPr>
+          <w:p>
+            <w:r>
+              <w:rPr>
+                <w:b/>
+                <w:sz w:val="18"/>
+              </w:rPr>
+              <w:t>ערך</w:t>
+            </w:r>
+          </w:p>
+        </w:tc>
+      </w:tr>
+      <w:tr>
+        <w:tc>
+          <w:tcPr>
+            <w:tcW w:type="dxa" w:w="4680"/>
+          </w:tcPr>
+          <w:p>
+            <w:r>
+              <w:rPr>
+                <w:sz w:val="18"/>
+              </w:rPr>
+              <w:t>לוח זמנים לפריסה</w:t>
+            </w:r>
+          </w:p>
+        </w:tc>
+        <w:tc>
+          <w:tcPr>
+            <w:tcW w:type="dxa" w:w="4680"/>
+          </w:tcPr>
+          <w:p>
+            <w:r>
+              <w:rPr>
+                <w:sz w:val="18"/>
+              </w:rPr>
+              <w:t>6 חודשים עד IOC</w:t>
+            </w:r>
+          </w:p>
+        </w:tc>
+      </w:tr>
+      <w:tr>
+        <w:tc>
+          <w:tcPr>
+            <w:tcW w:type="dxa" w:w="4680"/>
+          </w:tcPr>
+          <w:p>
+            <w:r>
+              <w:rPr>
+                <w:sz w:val="18"/>
+              </w:rPr>
+              <w:t>השקעה</w:t>
+            </w:r>
+          </w:p>
+        </w:tc>
+        <w:tc>
+          <w:tcPr>
+            <w:tcW w:type="dxa" w:w="4680"/>
+          </w:tcPr>
+          <w:p>
+            <w:r>
+              <w:rPr>
+                <w:sz w:val="18"/>
+              </w:rPr>
+              <w:t>$3–10M למגזר גבול</w:t>
+            </w:r>
+          </w:p>
+        </w:tc>
+      </w:tr>
+      <w:tr>
+        <w:tc>
+          <w:tcPr>
+            <w:tcW w:type="dxa" w:w="4680"/>
+          </w:tcPr>
+          <w:p>
+            <w:r>
+              <w:rPr>
+                <w:sz w:val="18"/>
+              </w:rPr>
+              <w:t>יחידות אווירוסטט (פריסה ראשונה)</w:t>
+            </w:r>
+          </w:p>
+        </w:tc>
+        <w:tc>
+          <w:tcPr>
+            <w:tcW w:type="dxa" w:w="4680"/>
+          </w:tcPr>
+          <w:p>
+            <w:r>
+              <w:rPr>
+                <w:sz w:val="18"/>
+              </w:rPr>
+              <w:t>10–40 אווירוסטטים טקטיים</w:t>
+            </w:r>
+          </w:p>
+        </w:tc>
+      </w:tr>
+      <w:tr>
+        <w:tc>
+          <w:tcPr>
+            <w:tcW w:type="dxa" w:w="4680"/>
+          </w:tcPr>
+          <w:p>
+            <w:r>
+              <w:rPr>
+                <w:sz w:val="18"/>
+              </w:rPr>
+              <w:t>כיסוי לסוללה (10 יחידות)</w:t>
+            </w:r>
+          </w:p>
+        </w:tc>
+        <w:tc>
+          <w:tcPr>
+            <w:tcW w:type="dxa" w:w="4680"/>
+          </w:tcPr>
+          <w:p>
+            <w:r>
+              <w:rPr>
+                <w:sz w:val="18"/>
+              </w:rPr>
+              <w:t>2.5 ק"מ מחסום רציף</w:t>
+            </w:r>
+          </w:p>
+        </w:tc>
+      </w:tr>
+      <w:tr>
+        <w:tc>
+          <w:tcPr>
+            <w:tcW w:type="dxa" w:w="4680"/>
+          </w:tcPr>
+          <w:p>
+            <w:r>
+              <w:rPr>
+                <w:sz w:val="18"/>
+              </w:rPr>
+              <w:t>גובה מחסום</w:t>
+            </w:r>
+          </w:p>
+        </w:tc>
+        <w:tc>
+          <w:tcPr>
+            <w:tcW w:type="dxa" w:w="4680"/>
+          </w:tcPr>
+          <w:p>
+            <w:r>
+              <w:rPr>
+                <w:sz w:val="18"/>
+              </w:rPr>
+              <w:t>מפני הקרקע עד 300–500 מ'</w:t>
+            </w:r>
+          </w:p>
+        </w:tc>
+      </w:tr>
+      <w:tr>
+        <w:tc>
+          <w:tcPr>
+            <w:tcW w:type="dxa" w:w="4680"/>
+          </w:tcPr>
+          <w:p>
+            <w:r>
+              <w:rPr>
+                <w:sz w:val="18"/>
+              </w:rPr>
+              <w:t>מרווח תליוני CF</w:t>
+            </w:r>
+          </w:p>
+        </w:tc>
+        <w:tc>
+          <w:tcPr>
+            <w:tcW w:type="dxa" w:w="4680"/>
+          </w:tcPr>
+          <w:p>
+            <w:r>
+              <w:rPr>
+                <w:sz w:val="18"/>
+              </w:rPr>
+              <w:t>2 מ' (צר מדי לכל רחפן לנווט דרכו)</w:t>
+            </w:r>
+          </w:p>
+        </w:tc>
+      </w:tr>
+      <w:tr>
+        <w:tc>
+          <w:tcPr>
+            <w:tcW w:type="dxa" w:w="4680"/>
+          </w:tcPr>
+          <w:p>
+            <w:r>
+              <w:rPr>
+                <w:sz w:val="18"/>
+              </w:rPr>
+              <w:t>אורך תליון</w:t>
+            </w:r>
+          </w:p>
+        </w:tc>
+        <w:tc>
+          <w:tcPr>
+            <w:tcW w:type="dxa" w:w="4680"/>
+          </w:tcPr>
+          <w:p>
+            <w:r>
+              <w:rPr>
+                <w:sz w:val="18"/>
+              </w:rPr>
+              <w:t>100–300 מ' (מהקרקע לאווירוסטט)</w:t>
+            </w:r>
+          </w:p>
+        </w:tc>
+      </w:tr>
+      <w:tr>
+        <w:tc>
+          <w:tcPr>
+            <w:tcW w:type="dxa" w:w="4680"/>
+          </w:tcPr>
+          <w:p>
+            <w:r>
+              <w:rPr>
+                <w:sz w:val="18"/>
+              </w:rPr>
+              <w:t>משקל לתליון (CF 1 מ"מ, 300 מ')</w:t>
+            </w:r>
+          </w:p>
+        </w:tc>
+        <w:tc>
+          <w:tcPr>
+            <w:tcW w:type="dxa" w:w="4680"/>
+          </w:tcPr>
+          <w:p>
+            <w:r>
+              <w:rPr>
+                <w:sz w:val="18"/>
+              </w:rPr>
+              <w:t>~0.5 ק"ג</w:t>
+            </w:r>
+          </w:p>
+        </w:tc>
+      </w:tr>
+      <w:tr>
+        <w:tc>
+          <w:tcPr>
+            <w:tcW w:type="dxa" w:w="4680"/>
+          </w:tcPr>
+          <w:p>
+            <w:r>
+              <w:rPr>
+                <w:sz w:val="18"/>
+              </w:rPr>
+              <w:t>משקל כולל תליונים לאווירוסטט (100 תליונים)</w:t>
+            </w:r>
+          </w:p>
+        </w:tc>
+        <w:tc>
+          <w:tcPr>
+            <w:tcW w:type="dxa" w:w="4680"/>
+          </w:tcPr>
+          <w:p>
+            <w:r>
+              <w:rPr>
+                <w:sz w:val="18"/>
+              </w:rPr>
+              <w:t>~50 ק"ג (בתוך קיבולת TCOM 22M / DURUS; Skystar משתמש בפחות/קצרים יותר)</w:t>
+            </w:r>
+          </w:p>
+        </w:tc>
+      </w:tr>
+      <w:tr>
+        <w:tc>
+          <w:tcPr>
+            <w:tcW w:type="dxa" w:w="4680"/>
+          </w:tcPr>
+          <w:p>
+            <w:r>
+              <w:rPr>
+                <w:sz w:val="18"/>
+              </w:rPr>
+              <w:t>סיבולת מבצעית</w:t>
+            </w:r>
+          </w:p>
+        </w:tc>
+        <w:tc>
+          <w:tcPr>
+            <w:tcW w:type="dxa" w:w="4680"/>
+          </w:tcPr>
+          <w:p>
+            <w:r>
+              <w:rPr>
+                <w:sz w:val="18"/>
+              </w:rPr>
+              <w:t>72 שעות (Skystar); ימים–שבועות (DURUS/TCOM)</w:t>
+            </w:r>
+          </w:p>
+        </w:tc>
+      </w:tr>
+    </w:tbl>
+    <w:p/>
+    <w:p>
+      <w:pPr>
+        <w:pStyle w:val="Heading2"/>
+      </w:pPr>
+      <w:r>
+        <w:t>למה זה לא סותר את התוכנית המלאה</w:t>
+      </w:r>
+    </w:p>
+    <w:p>
+      <w:r>
+        <w:t>זהו שלב 1 של מפת הדרכים — משתמש באותו חומר CF ובאותו קונספט תליוני כבל. כשפלטפורמות שלב 2/3 (TCOM 74K/420K, Airlander 10) יגיעו, האווירוסטטים הטקטיים הופכים ל:</w:t>
+      </w:r>
+    </w:p>
+    <w:p>
+      <w:pPr>
+        <w:pStyle w:val="ListBullet"/>
+      </w:pPr>
+      <w:r>
+        <w:t>אלמנטי סינון קדמיים למערכת הגדולה</w:t>
+      </w:r>
+    </w:p>
+    <w:p>
+      <w:pPr>
+        <w:pStyle w:val="ListBullet"/>
+      </w:pPr>
+      <w:r>
+        <w:t>יחידות ניידות לתגובה מהירה שסוגרות פערים</w:t>
+      </w:r>
+    </w:p>
+    <w:p>
+      <w:pPr>
+        <w:pStyle w:val="ListBullet"/>
+      </w:pPr>
+      <w:r>
+        <w:t>פלטפורמות אימון לפיתוח מפעילים</w:t>
+      </w:r>
+    </w:p>
+    <w:p>
+      <w:pPr>
+        <w:pStyle w:val="ListBullet"/>
+      </w:pPr>
+      <w:r>
+        <w:t>מערכות רזרבה לקיבולת עודפת בזמן מתקפות המוניות</w:t>
+      </w:r>
+    </w:p>
+    <w:p>
+      <w:pPr>
+        <w:pStyle w:val="Heading2"/>
+      </w:pPr>
+      <w:r>
+        <w:t>אימות קרבי</w:t>
+      </w:r>
+    </w:p>
+    <w:p>
+      <w:pPr>
+        <w:pStyle w:val="ListBullet"/>
+      </w:pPr>
+      <w:r>
+        <w:t>אוקראינה פרסה 50+ אווירוסטטים של Aerobavovna מבצעית (קודיפיקציה מאי 2026, The Defender Media)</w:t>
+      </w:r>
+    </w:p>
+    <w:p>
+      <w:pPr>
+        <w:pStyle w:val="ListBullet"/>
+      </w:pPr>
+      <w:r>
+        <w:t>צבא ארה"ב הערכת DURUS ב-Camp Atterbury 2025: 100% FMC, 97.5% שעות משימה (Defence Blog)</w:t>
+      </w:r>
+    </w:p>
+    <w:p>
+      <w:pPr>
+        <w:pStyle w:val="ListBullet"/>
+      </w:pPr>
+      <w:r>
+        <w:t>Skystar 180 מוכח מבצעית על ידי צה"ל וכוחות NATO מרובים (RT LTA Systems)</w:t>
+      </w:r>
+    </w:p>
+    <w:p>
+      <w:pPr>
+        <w:pStyle w:val="ListBullet"/>
+      </w:pPr>
+      <w:r>
+        <w:t>מערכת Barrier של רוסיה משתמשת באווירוסטטים דומים עם רשתות — נבדקה, הזמנות התקבלו (Business Insider, Militarnyi)</w:t>
+      </w:r>
+    </w:p>
+    <w:p>
+      <w:r>
+        <w:br w:type="page"/>
+      </w:r>
+    </w:p>
+    <w:p>
+      <w:pPr>
+        <w:pStyle w:val="Heading1"/>
+      </w:pPr>
+      <w:r>
+        <w:t>14ב. שימוש טקטי: פעולות אווירוסטט ניידות עם כוחות קרקע</w:t>
+      </w:r>
+    </w:p>
+    <w:p>
+      <w:pPr>
+        <w:pStyle w:val="Heading2"/>
+      </w:pPr>
+      <w:r>
+        <w:t>קונספט: סוללות אווירוסטט כהגנה אורגנית ליחידה</w:t>
+      </w:r>
+    </w:p>
+    <w:p>
+      <w:r>
+        <w:t>אווירוסטטים טקטיים עם תליוני CF יכולים לשמש כנכסי הגנה ניידים המוצמדים ליחידות כוחות קרקע, ומספקים הגנה מפני רחפנים בתנועה ובעמדה.</w:t>
+      </w:r>
+    </w:p>
+    <w:p>
+      <w:pPr>
+        <w:pStyle w:val="Heading2"/>
+      </w:pPr>
+      <w:r>
+        <w:t>תצורה 1: הגנת בסיס מבצעי מתקדם (FOB)</w:t>
+      </w:r>
+    </w:p>
+    <w:tbl>
+      <w:tblPr>
+        <w:tblStyle w:val="TableGrid"/>
+        <w:tblW w:type="auto" w:w="0"/>
+        <w:jc w:val="center"/>
+        <w:tblLook w:firstColumn="1" w:firstRow="1" w:lastColumn="0" w:lastRow="0" w:noHBand="0" w:noVBand="1" w:val="04A0"/>
+      </w:tblPr>
+      <w:tblGrid>
+        <w:gridCol w:w="4680"/>
+        <w:gridCol w:w="4680"/>
+      </w:tblGrid>
+      <w:tr>
+        <w:tc>
+          <w:tcPr>
+            <w:tcW w:type="dxa" w:w="4680"/>
+          </w:tcPr>
+          <w:p>
+            <w:r>
+              <w:rPr>
+                <w:b/>
+                <w:sz w:val="18"/>
+              </w:rPr>
+              <w:t>אלמנט</w:t>
+            </w:r>
+          </w:p>
+        </w:tc>
+        <w:tc>
+          <w:tcPr>
+            <w:tcW w:type="dxa" w:w="4680"/>
+          </w:tcPr>
+          <w:p>
+            <w:r>
+              <w:rPr>
+                <w:b/>
+                <w:sz w:val="18"/>
+              </w:rPr>
+              <w:t>מפרט</w:t>
+            </w:r>
+          </w:p>
+        </w:tc>
+      </w:tr>
+      <w:tr>
+        <w:tc>
+          <w:tcPr>
+            <w:tcW w:type="dxa" w:w="4680"/>
+          </w:tcPr>
+          <w:p>
+            <w:r>
+              <w:rPr>
+                <w:sz w:val="18"/>
+              </w:rPr>
+              <w:t>תצורה</w:t>
+            </w:r>
+          </w:p>
+        </w:tc>
+        <w:tc>
+          <w:tcPr>
+            <w:tcW w:type="dxa" w:w="4680"/>
+          </w:tcPr>
+          <w:p>
+            <w:r>
+              <w:rPr>
+                <w:sz w:val="18"/>
+              </w:rPr>
+              <w:t>4–8 אווירוסטטים בהיקף מעגלי</w:t>
+            </w:r>
+          </w:p>
+        </w:tc>
+      </w:tr>
+      <w:tr>
+        <w:tc>
+          <w:tcPr>
+            <w:tcW w:type="dxa" w:w="4680"/>
+          </w:tcPr>
+          <w:p>
+            <w:r>
+              <w:rPr>
+                <w:sz w:val="18"/>
+              </w:rPr>
+              <w:t>מרווח</w:t>
+            </w:r>
+          </w:p>
+        </w:tc>
+        <w:tc>
+          <w:tcPr>
+            <w:tcW w:type="dxa" w:w="4680"/>
+          </w:tcPr>
+          <w:p>
+            <w:r>
+              <w:rPr>
+                <w:sz w:val="18"/>
+              </w:rPr>
+              <w:t>200–250 מ' בין אווירוסטטים</w:t>
+            </w:r>
+          </w:p>
+        </w:tc>
+      </w:tr>
+      <w:tr>
+        <w:tc>
+          <w:tcPr>
+            <w:tcW w:type="dxa" w:w="4680"/>
+          </w:tcPr>
+          <w:p>
+            <w:r>
+              <w:rPr>
+                <w:sz w:val="18"/>
+              </w:rPr>
+              <w:t>כיסוי</w:t>
+            </w:r>
+          </w:p>
+        </w:tc>
+        <w:tc>
+          <w:tcPr>
+            <w:tcW w:type="dxa" w:w="4680"/>
+          </w:tcPr>
+          <w:p>
+            <w:r>
+              <w:rPr>
+                <w:sz w:val="18"/>
+              </w:rPr>
+              <w:t>אזור מוגן בקוטר 600–800 מ'</w:t>
+            </w:r>
+          </w:p>
+        </w:tc>
+      </w:tr>
+      <w:tr>
+        <w:tc>
+          <w:tcPr>
+            <w:tcW w:type="dxa" w:w="4680"/>
+          </w:tcPr>
+          <w:p>
+            <w:r>
+              <w:rPr>
+                <w:sz w:val="18"/>
+              </w:rPr>
+              <w:t>גובה</w:t>
+            </w:r>
+          </w:p>
+        </w:tc>
+        <w:tc>
+          <w:tcPr>
+            <w:tcW w:type="dxa" w:w="4680"/>
+          </w:tcPr>
+          <w:p>
+            <w:r>
+              <w:rPr>
+                <w:sz w:val="18"/>
+              </w:rPr>
+              <w:t>300–500 מ' עם תליונים לקרקע</w:t>
+            </w:r>
+          </w:p>
+        </w:tc>
+      </w:tr>
+      <w:tr>
+        <w:tc>
+          <w:tcPr>
+            <w:tcW w:type="dxa" w:w="4680"/>
+          </w:tcPr>
+          <w:p>
+            <w:r>
+              <w:rPr>
+                <w:sz w:val="18"/>
+              </w:rPr>
+              <w:t>זמן הקמה</w:t>
+            </w:r>
+          </w:p>
+        </w:tc>
+        <w:tc>
+          <w:tcPr>
+            <w:tcW w:type="dxa" w:w="4680"/>
+          </w:tcPr>
+          <w:p>
+            <w:r>
+              <w:rPr>
+                <w:sz w:val="18"/>
+              </w:rPr>
+              <w:t>20–30 דקות (Skystar/DURUS)</w:t>
+            </w:r>
+          </w:p>
+        </w:tc>
+      </w:tr>
+      <w:tr>
+        <w:tc>
+          <w:tcPr>
+            <w:tcW w:type="dxa" w:w="4680"/>
+          </w:tcPr>
+          <w:p>
+            <w:r>
+              <w:rPr>
+                <w:sz w:val="18"/>
+              </w:rPr>
+              <w:t>זמן פירוק</w:t>
+            </w:r>
+          </w:p>
+        </w:tc>
+        <w:tc>
+          <w:tcPr>
+            <w:tcW w:type="dxa" w:w="4680"/>
+          </w:tcPr>
+          <w:p>
+            <w:r>
+              <w:rPr>
+                <w:sz w:val="18"/>
+              </w:rPr>
+              <w:t>20–30 דקות</w:t>
+            </w:r>
+          </w:p>
+        </w:tc>
+      </w:tr>
+    </w:tbl>
+    <w:p/>
+    <w:p>
+      <w:pPr>
+        <w:pStyle w:val="Heading2"/>
+      </w:pPr>
+      <w:r>
+        <w:t>תצורה 2: הגנת שיירה (שיטת דילוג)</w:t>
+      </w:r>
+    </w:p>
+    <w:p>
+      <w:r>
+        <w:t>כוחות נעים לא יכולים לגרור אווירוסטטים מקושרים בנסיעה. פתרון: פריסת דילוג.</w:t>
+      </w:r>
+    </w:p>
+    <w:p>
+      <w:pPr>
+        <w:pStyle w:val="ListBullet"/>
+      </w:pPr>
+      <w:r>
+        <w:t>2 צוותים של 3 אווירוסטטים כל אחד</w:t>
+      </w:r>
+    </w:p>
+    <w:p>
+      <w:pPr>
+        <w:pStyle w:val="ListBullet"/>
+      </w:pPr>
+      <w:r>
+        <w:t>צוות א' פורש בנקודת ציון 1, מספק כיסוי בזמן שהשיירה עוברת</w:t>
+      </w:r>
+    </w:p>
+    <w:p>
+      <w:pPr>
+        <w:pStyle w:val="ListBullet"/>
+      </w:pPr>
+      <w:r>
+        <w:t>צוות ב' פורש בנקודת ציון 2 (5–10 ק"מ קדימה)</w:t>
+      </w:r>
+    </w:p>
+    <w:p>
+      <w:pPr>
+        <w:pStyle w:val="ListBullet"/>
+      </w:pPr>
+      <w:r>
+        <w:t>צוות א' אוסף, נוסע קדימה לנקודת ציון 3</w:t>
+      </w:r>
+    </w:p>
+    <w:p>
+      <w:pPr>
+        <w:pStyle w:val="ListBullet"/>
+      </w:pPr>
+      <w:r>
+        <w:t>המחזור ממשיך לאורך המסלול</w:t>
+      </w:r>
+    </w:p>
+    <w:tbl>
+      <w:tblPr>
+        <w:tblStyle w:val="TableGrid"/>
+        <w:tblW w:type="auto" w:w="0"/>
+        <w:jc w:val="center"/>
+        <w:tblLook w:firstColumn="1" w:firstRow="1" w:lastColumn="0" w:lastRow="0" w:noHBand="0" w:noVBand="1" w:val="04A0"/>
+      </w:tblPr>
+      <w:tblGrid>
+        <w:gridCol w:w="4680"/>
+        <w:gridCol w:w="4680"/>
+      </w:tblGrid>
+      <w:tr>
+        <w:tc>
+          <w:tcPr>
+            <w:tcW w:type="dxa" w:w="4680"/>
+          </w:tcPr>
+          <w:p>
+            <w:r>
+              <w:rPr>
+                <w:b/>
+                <w:sz w:val="18"/>
+              </w:rPr>
+              <w:t>אלמנט</w:t>
+            </w:r>
+          </w:p>
+        </w:tc>
+        <w:tc>
+          <w:tcPr>
+            <w:tcW w:type="dxa" w:w="4680"/>
+          </w:tcPr>
+          <w:p>
+            <w:r>
+              <w:rPr>
+                <w:b/>
+                <w:sz w:val="18"/>
+              </w:rPr>
+              <w:t>מפרט</w:t>
+            </w:r>
+          </w:p>
+        </w:tc>
+      </w:tr>
+      <w:tr>
+        <w:tc>
+          <w:tcPr>
+            <w:tcW w:type="dxa" w:w="4680"/>
+          </w:tcPr>
+          <w:p>
+            <w:r>
+              <w:rPr>
+                <w:sz w:val="18"/>
+              </w:rPr>
+              <w:t>צוותים</w:t>
+            </w:r>
+          </w:p>
+        </w:tc>
+        <w:tc>
+          <w:tcPr>
+            <w:tcW w:type="dxa" w:w="4680"/>
+          </w:tcPr>
+          <w:p>
+            <w:r>
+              <w:rPr>
+                <w:sz w:val="18"/>
+              </w:rPr>
+              <w:t>2 צוותים × 3 אווירוסטטים = 6 סה"כ</w:t>
+            </w:r>
+          </w:p>
+        </w:tc>
+      </w:tr>
+      <w:tr>
+        <w:tc>
+          <w:tcPr>
+            <w:tcW w:type="dxa" w:w="4680"/>
+          </w:tcPr>
+          <w:p>
+            <w:r>
+              <w:rPr>
+                <w:sz w:val="18"/>
+              </w:rPr>
+              <w:t>כלי רכב</w:t>
+            </w:r>
+          </w:p>
+        </w:tc>
+        <w:tc>
+          <w:tcPr>
+            <w:tcW w:type="dxa" w:w="4680"/>
+          </w:tcPr>
+          <w:p>
+            <w:r>
+              <w:rPr>
+                <w:sz w:val="18"/>
+              </w:rPr>
+              <w:t>6 מערכות על נגררים</w:t>
+            </w:r>
+          </w:p>
+        </w:tc>
+      </w:tr>
+      <w:tr>
+        <w:tc>
+          <w:tcPr>
+            <w:tcW w:type="dxa" w:w="4680"/>
+          </w:tcPr>
+          <w:p>
+            <w:r>
+              <w:rPr>
+                <w:sz w:val="18"/>
+              </w:rPr>
+              <w:t>מרחק דילוג</w:t>
+            </w:r>
+          </w:p>
+        </w:tc>
+        <w:tc>
+          <w:tcPr>
+            <w:tcW w:type="dxa" w:w="4680"/>
+          </w:tcPr>
+          <w:p>
+            <w:r>
+              <w:rPr>
+                <w:sz w:val="18"/>
+              </w:rPr>
+              <w:t>מקטעי 5–10 ק"מ</w:t>
+            </w:r>
+          </w:p>
+        </w:tc>
+      </w:tr>
+      <w:tr>
+        <w:tc>
+          <w:tcPr>
+            <w:tcW w:type="dxa" w:w="4680"/>
+          </w:tcPr>
+          <w:p>
+            <w:r>
+              <w:rPr>
+                <w:sz w:val="18"/>
+              </w:rPr>
+              <w:t>הקמה/פירוק</w:t>
+            </w:r>
+          </w:p>
+        </w:tc>
+        <w:tc>
+          <w:tcPr>
+            <w:tcW w:type="dxa" w:w="4680"/>
+          </w:tcPr>
+          <w:p>
+            <w:r>
+              <w:rPr>
+                <w:sz w:val="18"/>
+              </w:rPr>
+              <w:t>20 דקות כל אחד (Skystar 180)</w:t>
+            </w:r>
+          </w:p>
+        </w:tc>
+      </w:tr>
+      <w:tr>
+        <w:tc>
+          <w:tcPr>
+            <w:tcW w:type="dxa" w:w="4680"/>
+          </w:tcPr>
+          <w:p>
+            <w:r>
+              <w:rPr>
+                <w:sz w:val="18"/>
+              </w:rPr>
+              <w:t>תאימות מהירות שיירה</w:t>
+            </w:r>
+          </w:p>
+        </w:tc>
+        <w:tc>
+          <w:tcPr>
+            <w:tcW w:type="dxa" w:w="4680"/>
+          </w:tcPr>
+          <w:p>
+            <w:r>
+              <w:rPr>
+                <w:sz w:val="18"/>
+              </w:rPr>
+              <w:t>30–50 קמ"ש</w:t>
+            </w:r>
+          </w:p>
+        </w:tc>
+      </w:tr>
+      <w:tr>
+        <w:tc>
+          <w:tcPr>
+            <w:tcW w:type="dxa" w:w="4680"/>
+          </w:tcPr>
+          <w:p>
+            <w:r>
+              <w:rPr>
+                <w:sz w:val="18"/>
+              </w:rPr>
+              <w:t>כיסוי לעמדה</w:t>
+            </w:r>
+          </w:p>
+        </w:tc>
+        <w:tc>
+          <w:tcPr>
+            <w:tcW w:type="dxa" w:w="4680"/>
+          </w:tcPr>
+          <w:p>
+            <w:r>
+              <w:rPr>
+                <w:sz w:val="18"/>
+              </w:rPr>
+              <w:t>מחסום עילי בקוטר 750 מ'</w:t>
+            </w:r>
+          </w:p>
+        </w:tc>
+      </w:tr>
+    </w:tbl>
+    <w:p/>
+    <w:p>
+      <w:pPr>
+        <w:pStyle w:val="Heading2"/>
+      </w:pPr>
+      <w:r>
+        <w:t>תצורה 3: הגנת אזור כינוס / אזור הסתדרות</w:t>
+      </w:r>
+    </w:p>
+    <w:p>
+      <w:r>
+        <w:t>כאשר כוחות מרוכזים (הסתדרות לפני תקיפה, מוקד לוגיסטי, מפקדה):</w:t>
+      </w:r>
+    </w:p>
+    <w:p>
+      <w:pPr>
+        <w:pStyle w:val="ListBullet"/>
+      </w:pPr>
+      <w:r>
+        <w:t>פריסת 6–12 אווירוסטטים בתבנית רשת</w:t>
+      </w:r>
+    </w:p>
+    <w:p>
+      <w:pPr>
+        <w:pStyle w:val="ListBullet"/>
+      </w:pPr>
+      <w:r>
+        <w:t>מרווח 250 מ' יוצר מחסום עילי + צדדי רציף</w:t>
+      </w:r>
+    </w:p>
+    <w:p>
+      <w:pPr>
+        <w:pStyle w:val="ListBullet"/>
+      </w:pPr>
+      <w:r>
+        <w:t>מעבר מנייד לסטטי תוך 20–30 דקות</w:t>
+      </w:r>
+    </w:p>
+    <w:p>
+      <w:pPr>
+        <w:pStyle w:val="Heading2"/>
+      </w:pPr>
+      <w:r>
+        <w:t>תצורה 4: חיזוק מגזר גבול (גל)</w:t>
+      </w:r>
+    </w:p>
+    <w:p>
+      <w:r>
+        <w:t>בזמן הסלמת איום מודיעינית:</w:t>
+      </w:r>
+    </w:p>
+    <w:p>
+      <w:pPr>
+        <w:pStyle w:val="ListBullet"/>
+      </w:pPr>
+      <w:r>
+        <w:t>סוללות אווירוסטט ניידות ממוקמות מחדש ממגזרים שקטים למגזרים מאוימים</w:t>
+      </w:r>
+    </w:p>
+    <w:p>
+      <w:pPr>
+        <w:pStyle w:val="ListBullet"/>
+      </w:pPr>
+      <w:r>
+        <w:t>4 אווירוסטטים על נגררים יכולים להתפרס מחדש 50–100 ק"מ תוך 1–2 שעות</w:t>
+      </w:r>
+    </w:p>
+    <w:p>
+      <w:pPr>
+        <w:pStyle w:val="ListBullet"/>
+      </w:pPr>
+      <w:r>
+        <w:t>מבצעיים 20 דקות אחרי הגעה</w:t>
+      </w:r>
+    </w:p>
+    <w:p>
+      <w:pPr>
+        <w:pStyle w:val="Heading2"/>
+      </w:pPr>
+      <w:r>
+        <w:t>דוקטרינת ריכוז</w:t>
+      </w:r>
+    </w:p>
+    <w:tbl>
+      <w:tblPr>
+        <w:tblStyle w:val="TableGrid"/>
+        <w:tblW w:type="auto" w:w="0"/>
+        <w:jc w:val="center"/>
+        <w:tblLook w:firstColumn="1" w:firstRow="1" w:lastColumn="0" w:lastRow="0" w:noHBand="0" w:noVBand="1" w:val="04A0"/>
+      </w:tblPr>
+      <w:tblGrid>
+        <w:gridCol w:w="2340"/>
+        <w:gridCol w:w="2340"/>
+        <w:gridCol w:w="2340"/>
+        <w:gridCol w:w="2340"/>
+      </w:tblGrid>
+      <w:tr>
+        <w:tc>
+          <w:tcPr>
+            <w:tcW w:type="dxa" w:w="2340"/>
+          </w:tcPr>
+          <w:p>
+            <w:r>
+              <w:rPr>
+                <w:b/>
+                <w:sz w:val="18"/>
+              </w:rPr>
+              <w:t>גודל יחידה</w:t>
+            </w:r>
+          </w:p>
+        </w:tc>
+        <w:tc>
+          <w:tcPr>
+            <w:tcW w:type="dxa" w:w="2340"/>
+          </w:tcPr>
+          <w:p>
+            <w:r>
+              <w:rPr>
+                <w:b/>
+                <w:sz w:val="18"/>
+              </w:rPr>
+              <w:t>אווירוסטטים</w:t>
+            </w:r>
+          </w:p>
+        </w:tc>
+        <w:tc>
+          <w:tcPr>
+            <w:tcW w:type="dxa" w:w="2340"/>
+          </w:tcPr>
+          <w:p>
+            <w:r>
+              <w:rPr>
+                <w:b/>
+                <w:sz w:val="18"/>
+              </w:rPr>
+              <w:t>כיסוי</w:t>
+            </w:r>
+          </w:p>
+        </w:tc>
+        <w:tc>
+          <w:tcPr>
+            <w:tcW w:type="dxa" w:w="2340"/>
+          </w:tcPr>
+          <w:p>
+            <w:r>
+              <w:rPr>
+                <w:b/>
+                <w:sz w:val="18"/>
+              </w:rPr>
+              <w:t>דרג פיקוד</w:t>
+            </w:r>
+          </w:p>
+        </w:tc>
+      </w:tr>
+      <w:tr>
+        <w:tc>
+          <w:tcPr>
+            <w:tcW w:type="dxa" w:w="2340"/>
+          </w:tcPr>
+          <w:p>
+            <w:r>
+              <w:rPr>
+                <w:sz w:val="18"/>
+              </w:rPr>
+              <w:t>מסך מחלקתי</w:t>
+            </w:r>
+          </w:p>
+        </w:tc>
+        <w:tc>
+          <w:tcPr>
+            <w:tcW w:type="dxa" w:w="2340"/>
+          </w:tcPr>
+          <w:p>
+            <w:r>
+              <w:rPr>
+                <w:sz w:val="18"/>
+              </w:rPr>
+              <w:t>2–3</w:t>
+            </w:r>
+          </w:p>
+        </w:tc>
+        <w:tc>
+          <w:tcPr>
+            <w:tcW w:type="dxa" w:w="2340"/>
+          </w:tcPr>
+          <w:p>
+            <w:r>
+              <w:rPr>
+                <w:sz w:val="18"/>
+              </w:rPr>
+              <w:t>נקודתי (500 מ')</w:t>
+            </w:r>
+          </w:p>
+        </w:tc>
+        <w:tc>
+          <w:tcPr>
+            <w:tcW w:type="dxa" w:w="2340"/>
+          </w:tcPr>
+          <w:p>
+            <w:r>
+              <w:rPr>
+                <w:sz w:val="18"/>
+              </w:rPr>
+              <w:t>סמל מחלקה</w:t>
+            </w:r>
+          </w:p>
+        </w:tc>
+      </w:tr>
+      <w:tr>
+        <w:tc>
+          <w:tcPr>
+            <w:tcW w:type="dxa" w:w="2340"/>
+          </w:tcPr>
+          <w:p>
+            <w:r>
+              <w:rPr>
+                <w:sz w:val="18"/>
+              </w:rPr>
+              <w:t>עמדת פלוגה</w:t>
+            </w:r>
+          </w:p>
+        </w:tc>
+        <w:tc>
+          <w:tcPr>
+            <w:tcW w:type="dxa" w:w="2340"/>
+          </w:tcPr>
+          <w:p>
+            <w:r>
+              <w:rPr>
+                <w:sz w:val="18"/>
+              </w:rPr>
+              <w:t>4–8</w:t>
+            </w:r>
+          </w:p>
+        </w:tc>
+        <w:tc>
+          <w:tcPr>
+            <w:tcW w:type="dxa" w:w="2340"/>
+          </w:tcPr>
+          <w:p>
+            <w:r>
+              <w:rPr>
+                <w:sz w:val="18"/>
+              </w:rPr>
+              <w:t>היקף (קוטר 800 מ')</w:t>
+            </w:r>
+          </w:p>
+        </w:tc>
+        <w:tc>
+          <w:tcPr>
+            <w:tcW w:type="dxa" w:w="2340"/>
+          </w:tcPr>
+          <w:p>
+            <w:r>
+              <w:rPr>
+                <w:sz w:val="18"/>
+              </w:rPr>
+              <w:t>מפקד פלוגה</w:t>
+            </w:r>
+          </w:p>
+        </w:tc>
+      </w:tr>
+      <w:tr>
+        <w:tc>
+          <w:tcPr>
+            <w:tcW w:type="dxa" w:w="2340"/>
+          </w:tcPr>
+          <w:p>
+            <w:r>
+              <w:rPr>
+                <w:sz w:val="18"/>
+              </w:rPr>
+              <w:t>אזור כינוס גדוד</w:t>
+            </w:r>
+          </w:p>
+        </w:tc>
+        <w:tc>
+          <w:tcPr>
+            <w:tcW w:type="dxa" w:w="2340"/>
+          </w:tcPr>
+          <w:p>
+            <w:r>
+              <w:rPr>
+                <w:sz w:val="18"/>
+              </w:rPr>
+              <w:t>8–16</w:t>
+            </w:r>
+          </w:p>
+        </w:tc>
+        <w:tc>
+          <w:tcPr>
+            <w:tcW w:type="dxa" w:w="2340"/>
+          </w:tcPr>
+          <w:p>
+            <w:r>
+              <w:rPr>
+                <w:sz w:val="18"/>
+              </w:rPr>
+              <w:t>מלא (קוטר 1.5 ק"מ)</w:t>
+            </w:r>
+          </w:p>
+        </w:tc>
+        <w:tc>
+          <w:tcPr>
+            <w:tcW w:type="dxa" w:w="2340"/>
+          </w:tcPr>
+          <w:p>
+            <w:r>
+              <w:rPr>
+                <w:sz w:val="18"/>
+              </w:rPr>
+              <w:t>קמ"ב גדוד</w:t>
+            </w:r>
+          </w:p>
+        </w:tc>
+      </w:tr>
+      <w:tr>
+        <w:tc>
+          <w:tcPr>
+            <w:tcW w:type="dxa" w:w="2340"/>
+          </w:tcPr>
+          <w:p>
+            <w:r>
+              <w:rPr>
+                <w:sz w:val="18"/>
+              </w:rPr>
+              <w:t>אזור הסתדרות חטיבה</w:t>
+            </w:r>
+          </w:p>
+        </w:tc>
+        <w:tc>
+          <w:tcPr>
+            <w:tcW w:type="dxa" w:w="2340"/>
+          </w:tcPr>
+          <w:p>
+            <w:r>
+              <w:rPr>
+                <w:sz w:val="18"/>
+              </w:rPr>
+              <w:t>16–32</w:t>
+            </w:r>
+          </w:p>
+        </w:tc>
+        <w:tc>
+          <w:tcPr>
+            <w:tcW w:type="dxa" w:w="2340"/>
+          </w:tcPr>
+          <w:p>
+            <w:r>
+              <w:rPr>
+                <w:sz w:val="18"/>
+              </w:rPr>
+              <w:t>רחב (קוטר 3 ק"מ)</w:t>
+            </w:r>
+          </w:p>
+        </w:tc>
+        <w:tc>
+          <w:tcPr>
+            <w:tcW w:type="dxa" w:w="2340"/>
+          </w:tcPr>
+          <w:p>
+            <w:r>
+              <w:rPr>
+                <w:sz w:val="18"/>
+              </w:rPr>
+              <w:t>קצין הגנה אווירית חטיבתי</w:t>
+            </w:r>
+          </w:p>
+        </w:tc>
+      </w:tr>
+      <w:tr>
+        <w:tc>
+          <w:tcPr>
+            <w:tcW w:type="dxa" w:w="2340"/>
+          </w:tcPr>
+          <w:p>
+            <w:r>
+              <w:rPr>
+                <w:sz w:val="18"/>
+              </w:rPr>
+              <w:t>מגזר גבול (סטטי)</w:t>
+            </w:r>
+          </w:p>
+        </w:tc>
+        <w:tc>
+          <w:tcPr>
+            <w:tcW w:type="dxa" w:w="2340"/>
+          </w:tcPr>
+          <w:p>
+            <w:r>
+              <w:rPr>
+                <w:sz w:val="18"/>
+              </w:rPr>
+              <w:t>40–100</w:t>
+            </w:r>
+          </w:p>
+        </w:tc>
+        <w:tc>
+          <w:tcPr>
+            <w:tcW w:type="dxa" w:w="2340"/>
+          </w:tcPr>
+          <w:p>
+            <w:r>
+              <w:rPr>
+                <w:sz w:val="18"/>
+              </w:rPr>
+              <w:t>רציף (10–25 ק"מ)</w:t>
+            </w:r>
+          </w:p>
+        </w:tc>
+        <w:tc>
+          <w:tcPr>
+            <w:tcW w:type="dxa" w:w="2340"/>
+          </w:tcPr>
+          <w:p>
+            <w:r>
+              <w:rPr>
+                <w:sz w:val="18"/>
+              </w:rPr>
+              <w:t>אוגדה/פיקוד</w:t>
+            </w:r>
+          </w:p>
+        </w:tc>
+      </w:tr>
+    </w:tbl>
+    <w:p/>
+    <w:p>
+      <w:pPr>
+        <w:pStyle w:val="Heading2"/>
+      </w:pPr>
+      <w:r>
+        <w:t>עקרונות שימוש נייד</w:t>
+      </w:r>
+    </w:p>
+    <w:p>
+      <w:r>
+        <w:t>1. נע עם הכוח — אווירוסטטים על נגררים נעים בשיירה, נפרשים בעצירות</w:t>
+      </w:r>
+    </w:p>
+    <w:p>
+      <w:r>
+        <w:t>2. דילוג לכיסוי רציף — צוותים מתחלפים מבטיחים אין פער בהגנה</w:t>
+      </w:r>
+    </w:p>
+    <w:p>
+      <w:r>
+        <w:t>3. ריכוז למסה — ריכוז אווירוסטטים כשכוחות מרוכזים</w:t>
+      </w:r>
+    </w:p>
+    <w:p>
+      <w:r>
+        <w:t>4. פיזור לשרידות — פיזור כשקיים איום ארטילרי/רקטי</w:t>
+      </w:r>
+    </w:p>
+    <w:p>
+      <w:r>
+        <w:t>5. שילוב עם C-UAS — מחסום רשת תופס; לוחמה אלקטרונית/תותחים מטפלים בחודרים</w:t>
+      </w:r>
+    </w:p>
+    <w:p>
+      <w:r>
+        <w:t>6. מעבר מהיר — אותו ציוד משרת משימות ניידות, חצי-סטטיות וסטטיות</w:t>
+      </w:r>
+    </w:p>
+    <w:p>
+      <w:pPr>
+        <w:pStyle w:val="Heading2"/>
+      </w:pPr>
+      <w:r>
+        <w:t>שילוב עם דוקטרינת צה"ל הקיימת</w:t>
+      </w:r>
+    </w:p>
+    <w:p>
+      <w:r>
+        <w:t>צה"ל כבר משתמש באווירוסטטים של Skystar לסקירה. הוספת תליוני כבל CF היא שדרוג מצטבר:</w:t>
+      </w:r>
+    </w:p>
+    <w:p>
+      <w:pPr>
+        <w:pStyle w:val="ListBullet"/>
+      </w:pPr>
+      <w:r>
+        <w:t>Skystar 180 (RT LTA Systems, ישראל) — בשירות צה"ל, מבוסס נגרר, 20 דקות פריסה</w:t>
+      </w:r>
+    </w:p>
+    <w:p>
+      <w:pPr>
+        <w:pStyle w:val="ListBullet"/>
+      </w:pPr>
+      <w:r>
+        <w:t>DURUS (Silicis, ארה"ב) — צבא ארה"ב הערכה, דקות לפריסה, מסוגל C-UAS</w:t>
+      </w:r>
+    </w:p>
+    <w:p>
+      <w:pPr>
+        <w:pStyle w:val="ListBullet"/>
+      </w:pPr>
+      <w:r>
+        <w:t>AB12TC (Aerobavovna, אוקראינה) — מוכח בקרב, $40K/יחידה, 50+ נפרשו מבצעית</w:t>
+      </w:r>
+    </w:p>
+    <w:p>
+      <w:r>
+        <w:t>לפלטפורמות אלה ערוצי רכש, תוכניות אימון ותמיכה לוגיסטית קיימים.</w:t>
+      </w:r>
+    </w:p>
+    <w:p>
+      <w:pPr>
+        <w:pStyle w:val="Heading2"/>
+      </w:pPr>
+      <w:r>
+        <w:t>מקורות</w:t>
+      </w:r>
+    </w:p>
+    <w:p>
+      <w:r>
+        <w:t>[T12] Defence Blog, "U.S. Army evaluates aerostats for counter-drone role." https://defence-blog.com/u-s-army-evaluates-aerostats-for-counter-drone-role/</w:t>
+      </w:r>
+    </w:p>
+    <w:p>
+      <w:r>
+        <w:t>[T13] RT Aerostat (RT LTA Systems), "Skystar 180." https://rtaerostat.com/skystar-180</w:t>
+      </w:r>
+    </w:p>
+    <w:p>
+      <w:r>
+        <w:t>[T14] Silicis Technologies, "DURUS Tactical Aerostat." https://www.silicis.com/durus-01</w:t>
+      </w:r>
+    </w:p>
+    <w:p>
+      <w:r>
+        <w:t>[T15] The Defender Media, "Ministry of Defence codifies Aerobavovna's first aerostat," מאי 2026. https://thedefender.media/en/2026/05/aerostat-aerobavovna/</w:t>
+      </w:r>
+    </w:p>
+    <w:p>
+      <w:r>
+        <w:t>[T16] TCOM LP, "Tethered Aerostats — Tactical Platforms." https://tcomlp.com/aerospace-platforms/tethered-aerostats/</w:t>
+      </w:r>
+    </w:p>
     <w:p>
       <w:r>
         <w:br w:type="page"/>

</xml_diff>